<commit_message>
Update step-by-step guide for the new repo layout
</commit_message>
<xml_diff>
--- a/HuongDan_MoProject_MayMoi.docx
+++ b/HuongDan_MoProject_MayMoi.docx
@@ -209,7 +209,7 @@
           <w:sz w:val="20"/>
           <w:szCs w:val="20"/>
         </w:rPr>
-        <w:t xml:space="preserve">git clone https://github.com/thanhtruong332/RISSP-Paper-Vivado.git D:\RISSP</w:t>
+        <w:t xml:space="preserve">git clone https://github.com/thanhtruong332/RISP_Based_SoC_for_Crypto.git D:\RISSP</w:t>
       </w:r>
     </w:p>
     <w:p>
@@ -352,7 +352,7 @@
           <w:sz w:val="22"/>
           <w:szCs w:val="22"/>
         </w:rPr>
-        <w:t xml:space="preserve">Vào thư mục D:\RISSP\advance_topic\ → mở thư mục của SoC muốn dùng.</w:t>
+        <w:t xml:space="preserve">Vào thư mục D:\RISSP\hardware\projects\ → mở thư mục của SoC muốn dùng (RISSP_SoC, RV32I_SoC hoặc Ibex_SoC).</w:t>
       </w:r>
     </w:p>
     <w:p>
@@ -655,7 +655,7 @@
                 <w:sz w:val="19"/>
                 <w:szCs w:val="19"/>
               </w:rPr>
-              <w:t xml:space="preserve">SE-RISSP_AES_ULTRA.xpr</w:t>
+              <w:t xml:space="preserve">RISSP_SoC\SE-RISSP_AES_ULTRA.xpr</w:t>
             </w:r>
           </w:p>
         </w:tc>
@@ -747,7 +747,7 @@
                 <w:sz w:val="19"/>
                 <w:szCs w:val="19"/>
               </w:rPr>
-              <w:t xml:space="preserve">RV32I_soc_ULTRA.xpr</w:t>
+              <w:t xml:space="preserve">RV32I_SoC\RV32I_soc_ULTRA.xpr</w:t>
             </w:r>
           </w:p>
         </w:tc>
@@ -839,7 +839,7 @@
                 <w:sz w:val="19"/>
                 <w:szCs w:val="19"/>
               </w:rPr>
-              <w:t xml:space="preserve">Ibex_SoC.xpr</w:t>
+              <w:t xml:space="preserve">Ibex_SoC\Ibex_SoC.xpr</w:t>
             </w:r>
           </w:p>
         </w:tc>
@@ -977,7 +977,7 @@
           <w:sz w:val="22"/>
           <w:szCs w:val="22"/>
         </w:rPr>
-        <w:t xml:space="preserve"> → tab Other Options → ô Coe File → chọn file trong D:\RISSP\firmware_testbench\SE-RISSP_FULL\ → OK.</w:t>
+        <w:t xml:space="preserve"> → tab Other Options → ô Coe File → chọn file trong D:\RISSP\hardware\firmware\ → OK.</w:t>
       </w:r>
     </w:p>
     <w:p>
@@ -1118,7 +1118,7 @@
           <w:sz w:val="20"/>
           <w:szCs w:val="20"/>
         </w:rPr>
-        <w:t xml:space="preserve">Bảng ghép đúng cặp. File .coe ở firmware_testbench\SE-RISSP_FULL\ (dùng chung cả 3 lõi); testbench ở firmware_testbench\&lt;lõi&gt;_FULL\</w:t>
+        <w:t xml:space="preserve">Bảng ghép đúng cặp. File .coe ở hardware\firmware\ (dùng chung cả 3 lõi); testbench ở hardware\testbench\&lt;lõi&gt;\</w:t>
       </w:r>
     </w:p>
     <w:tbl>
@@ -1233,7 +1233,7 @@
                 <w:sz w:val="19"/>
                 <w:szCs w:val="19"/>
               </w:rPr>
-              <w:t xml:space="preserve">RISSP (SE-RISSP_FULL)</w:t>
+              <w:t xml:space="preserve">RISSP (testbench\rissp)</w:t>
             </w:r>
           </w:p>
         </w:tc>
@@ -1264,7 +1264,7 @@
                 <w:sz w:val="19"/>
                 <w:szCs w:val="19"/>
               </w:rPr>
-              <w:t xml:space="preserve">RV32I (RV32I_FULL)</w:t>
+              <w:t xml:space="preserve">RV32I (testbench\rv32i)</w:t>
             </w:r>
           </w:p>
         </w:tc>
@@ -1295,7 +1295,7 @@
                 <w:sz w:val="19"/>
                 <w:szCs w:val="19"/>
               </w:rPr>
-              <w:t xml:space="preserve">Ibex (Ibex_FULL)</w:t>
+              <w:t xml:space="preserve">Ibex (testbench\ibex)</w:t>
             </w:r>
           </w:p>
         </w:tc>

</xml_diff>